<commit_message>
fix: v0.14.2 installer safety and private order ZIP fulfillment
</commit_message>
<xml_diff>
--- a/docs/manual/使用手册.docx
+++ b/docs/manual/使用手册.docx
@@ -22,13 +22,7 @@
         <w:jc w:val="center"/>
       </w:pPr>
       <w:r>
-        <w:rPr>
-          <w:rFonts w:ascii="微软雅黑" w:hAnsi="微软雅黑" w:eastAsia="微软雅黑"/>
-          <w:b w:val="0"/>
-          <w:color w:val="4F5D75"/>
-          <w:sz w:val="19"/>
-        </w:rPr>
-        <w:t>适用版本 v0.13.1+ ｜ Windows 为主（Mac 见 §7）｜ 售后微信：xjinya（加后拉群）</w:t>
+        <w:t>适用版本 v0.14.2+ ｜ Windows 为主（Mac 见 §7）｜ 售后微信：xjinya（加后拉群）</w:t>
       </w:r>
     </w:p>
     <w:p>
@@ -79,11 +73,6 @@
               <w:spacing w:line="312" w:lineRule="auto"/>
             </w:pPr>
             <w:r>
-              <w:rPr>
-                <w:rFonts w:ascii="微软雅黑" w:hAnsi="微软雅黑" w:eastAsia="微软雅黑"/>
-                <w:b/>
-                <w:sz w:val="20"/>
-              </w:rPr>
               <w:t>商品</w:t>
             </w:r>
           </w:p>
@@ -97,11 +86,6 @@
               <w:spacing w:line="312" w:lineRule="auto"/>
             </w:pPr>
             <w:r>
-              <w:rPr>
-                <w:rFonts w:ascii="微软雅黑" w:hAnsi="微软雅黑" w:eastAsia="微软雅黑"/>
-                <w:b/>
-                <w:sz w:val="20"/>
-              </w:rPr>
               <w:t>内容</w:t>
             </w:r>
           </w:p>
@@ -117,10 +101,6 @@
               <w:spacing w:line="312" w:lineRule="auto"/>
             </w:pPr>
             <w:r>
-              <w:rPr>
-                <w:rFonts w:ascii="微软雅黑" w:hAnsi="微软雅黑" w:eastAsia="微软雅黑"/>
-                <w:sz w:val="20"/>
-              </w:rPr>
               <w:t>基础包 ¥20</w:t>
             </w:r>
           </w:p>
@@ -134,11 +114,7 @@
               <w:spacing w:line="312" w:lineRule="auto"/>
             </w:pPr>
             <w:r>
-              <w:rPr>
-                <w:rFonts w:ascii="微软雅黑" w:hAnsi="微软雅黑" w:eastAsia="微软雅黑"/>
-                <w:sz w:val="20"/>
-              </w:rPr>
-              <w:t>25 个跨职业技能（想清楚 5 / 排得起 5 / 兜得住 7 / 算得清 3 / 用得爽 5）+ 11 条即用指令 + 角色工作流 + 3 个月周更</w:t>
+              <w:t>25 个跨职业技能（想清楚 5 / 排得起 5 / 兜得住 7 / 算得清 3 / 用得爽 5）+ 11 条即用指令 + 角色工作流 + 90天月度内容更新</w:t>
             </w:r>
           </w:p>
         </w:tc>
@@ -153,10 +129,6 @@
               <w:spacing w:line="312" w:lineRule="auto"/>
             </w:pPr>
             <w:r>
-              <w:rPr>
-                <w:rFonts w:ascii="微软雅黑" w:hAnsi="微软雅黑" w:eastAsia="微软雅黑"/>
-                <w:sz w:val="20"/>
-              </w:rPr>
               <w:t>PM 方向包 ¥30（含基础层）</w:t>
             </w:r>
           </w:p>
@@ -170,10 +142,6 @@
               <w:spacing w:line="312" w:lineRule="auto"/>
             </w:pPr>
             <w:r>
-              <w:rPr>
-                <w:rFonts w:ascii="微软雅黑" w:hAnsi="微软雅黑" w:eastAsia="微软雅黑"/>
-                <w:sz w:val="20"/>
-              </w:rPr>
               <w:t>上面全部 + 12 个 AI 产品经理技能 + 31 条 PM 指令 + 九环 PM 工作流，共 37 技能 / 42 指令</w:t>
             </w:r>
           </w:p>
@@ -186,13 +154,7 @@
         <w:ind w:firstLine="420"/>
       </w:pPr>
       <w:r>
-        <w:rPr>
-          <w:rFonts w:ascii="微软雅黑" w:hAnsi="微软雅黑" w:eastAsia="微软雅黑"/>
-          <w:b w:val="0"/>
-          <w:color w:val="2D3142"/>
-          <w:sz w:val="21"/>
-        </w:rPr>
-        <w:t>全程零 API key、只新增不覆盖（自动备份可回滚）、每周更新。</w:t>
+        <w:t>全程零 API key、精确合并，冲突保留（自动备份可回滚）、每月内容更新。</w:t>
       </w:r>
     </w:p>
     <w:p>
@@ -214,11 +176,7 @@
         <w:spacing w:before="200" w:after="120"/>
       </w:pPr>
       <w:r>
-        <w:rPr>
-          <w:rFonts w:ascii="微软雅黑" w:hAnsi="微软雅黑" w:eastAsia="微软雅黑"/>
-          <w:color w:val="2D3142"/>
-        </w:rPr>
-        <w:t>第 1 步：打开 PowerShell</w:t>
+        <w:t>第 1 步：下载订单专属 ZIP，完整解压到本地目录。</w:t>
       </w:r>
     </w:p>
     <w:p>
@@ -242,11 +200,7 @@
         <w:spacing w:before="200" w:after="120"/>
       </w:pPr>
       <w:r>
-        <w:rPr>
-          <w:rFonts w:ascii="微软雅黑" w:hAnsi="微软雅黑" w:eastAsia="微软雅黑"/>
-          <w:color w:val="2D3142"/>
-        </w:rPr>
-        <w:t>第 2 步：粘贴你的专属安装命令，回车</w:t>
+        <w:t>第 2 步：Windows 双击 install-windows.bat；macOS 双击 install-macos.command；Linux 运行 bash install-linux.sh。</w:t>
       </w:r>
     </w:p>
     <w:p>
@@ -254,11 +208,7 @@
         <w:spacing w:line="312" w:lineRule="auto" w:after="160"/>
       </w:pPr>
       <w:r>
-        <w:rPr>
-          <w:rFonts w:ascii="Consolas" w:hAnsi="Consolas" w:eastAsia="微软雅黑"/>
-          <w:sz w:val="19"/>
-        </w:rPr>
-        <w:t>irm https://asp-registry-xjinya.oss-cn-hangzhou.aliyuncs.com/i/你的token.ps1 | iex</w:t>
+        <w:t>Windows 命令行：powershell -NoProfile -ExecutionPolicy Bypass -File ./install.ps1 -Cli</w:t>
       </w:r>
     </w:p>
     <w:p>
@@ -267,13 +217,7 @@
         <w:ind w:firstLine="420"/>
       </w:pPr>
       <w:r>
-        <w:rPr>
-          <w:rFonts w:ascii="微软雅黑" w:hAnsi="微软雅黑" w:eastAsia="微软雅黑"/>
-          <w:b w:val="0"/>
-          <w:color w:val="2D3142"/>
-          <w:sz w:val="21"/>
-        </w:rPr>
-        <w:t>这条命令是你订单的专属凭证（下单时卖家发给你），请保存好；转卖它等于转卖整个订单。以后更新也是这同一条命令。</w:t>
+        <w:t>ZIP 的下载链接每3天刷新，过期索取卖家最新链接；已安装内容不因链接过期失效。专属链接不要公开。</w:t>
       </w:r>
     </w:p>
     <w:p>
@@ -295,13 +239,7 @@
         <w:ind w:firstLine="420"/>
       </w:pPr>
       <w:r>
-        <w:rPr>
-          <w:rFonts w:ascii="微软雅黑" w:hAnsi="微软雅黑" w:eastAsia="微软雅黑"/>
-          <w:b w:val="0"/>
-          <w:color w:val="2D3142"/>
-          <w:sz w:val="21"/>
-        </w:rPr>
-        <w:t>命令会弹出本地安装配置页（在你自己的电脑上运行，不经任何服务器）：上面自动列出探测到的 AI 工具（勾你要装的），下面是你购买的内容清单（技能逐项可勾、默认全选），点「开始安装」：</w:t>
+        <w:t>Windows 双击入口打开本地安装配置页；CLI入口直接安装。Mac/Linux当前为终端安装。</w:t>
       </w:r>
     </w:p>
     <w:p>
@@ -448,11 +386,7 @@
         <w:spacing w:before="280" w:after="120"/>
       </w:pPr>
       <w:r>
-        <w:rPr>
-          <w:rFonts w:ascii="微软雅黑" w:hAnsi="微软雅黑" w:eastAsia="微软雅黑"/>
-          <w:color w:val="2D3142"/>
-        </w:rPr>
-        <w:t>3. 每周更新</w:t>
+        <w:t>3. 每月内容更新</w:t>
       </w:r>
     </w:p>
     <w:p>
@@ -461,11 +395,7 @@
         <w:spacing w:line="312" w:lineRule="auto" w:after="80"/>
       </w:pPr>
       <w:r>
-        <w:rPr>
-          <w:rFonts w:ascii="微软雅黑" w:hAnsi="微软雅黑" w:eastAsia="微软雅黑"/>
-          <w:sz w:val="21"/>
-        </w:rPr>
-        <w:t>双击 C:\Users\你的用户名\asp-coldstart\update-token.bat（推荐）</w:t>
+        <w:t>每月新内容发布后，下载卖家群通知/私信提供的新ZIP，解压并运行相同入口。</w:t>
       </w:r>
     </w:p>
     <w:p>
@@ -474,11 +404,7 @@
         <w:spacing w:line="312" w:lineRule="auto" w:after="80"/>
       </w:pPr>
       <w:r>
-        <w:rPr>
-          <w:rFonts w:ascii="微软雅黑" w:hAnsi="微软雅黑" w:eastAsia="微软雅黑"/>
-          <w:sz w:val="21"/>
-        </w:rPr>
-        <w:t>或重跑购买时发给你的那条安装命令</w:t>
+        <w:t>更新后安装到固定目录，保留状态、冲突记录及备份。</w:t>
       </w:r>
     </w:p>
     <w:p>
@@ -541,13 +467,7 @@
         <w:ind w:firstLine="420"/>
       </w:pPr>
       <w:r>
-        <w:rPr>
-          <w:rFonts w:ascii="微软雅黑" w:hAnsi="微软雅黑" w:eastAsia="微软雅黑"/>
-          <w:b w:val="0"/>
-          <w:color w:val="2D3142"/>
-          <w:sz w:val="21"/>
-        </w:rPr>
-        <w:t>想全自动？双击同目录的 enable-weekly-autoupdate.bat 开启每周日 10:00 自动更新（默认关闭；disable-… 随时关）。</w:t>
+        <w:t>默认不创建本机自动任务。卖家每72小时刷新链接；技能内容每月更新一次。</w:t>
       </w:r>
     </w:p>
     <w:p>
@@ -796,13 +716,7 @@
         <w:spacing w:line="312" w:lineRule="auto" w:after="120"/>
       </w:pPr>
       <w:r>
-        <w:rPr>
-          <w:rFonts w:ascii="微软雅黑" w:hAnsi="微软雅黑" w:eastAsia="微软雅黑"/>
-          <w:b w:val="0"/>
-          <w:color w:val="2D3142"/>
-          <w:sz w:val="21"/>
-        </w:rPr>
-        <w:t>购买含 3 个月周更；之后续更以商品页或客服告知为准。</w:t>
+        <w:t>购买含 90天月度内容更新；之后续更以商品页或客服告知为准。</w:t>
       </w:r>
     </w:p>
     <w:p>
@@ -852,13 +766,7 @@
         <w:ind w:firstLine="420"/>
       </w:pPr>
       <w:r>
-        <w:rPr>
-          <w:rFonts w:ascii="微软雅黑" w:hAnsi="微软雅黑" w:eastAsia="微软雅黑"/>
-          <w:b w:val="0"/>
-          <w:color w:val="2D3142"/>
-          <w:sz w:val="21"/>
-        </w:rPr>
-        <w:t>安装/更新/迁移命令行可用：curl -fsSL https://asp-registry-xjinya.oss-cn-hangzhou.aliyuncs.com/i/你的token.sh | bash。图形选择页当前为 Windows 提供；遇到问题群里反馈。</w:t>
+        <w:t>macOS/Linux：bash ./install.sh；需要 bash、python3。原生真机兼容仍需验收。</w:t>
       </w:r>
     </w:p>
     <w:p>
@@ -880,13 +788,7 @@
         <w:ind w:firstLine="420"/>
       </w:pPr>
       <w:r>
-        <w:rPr>
-          <w:rFonts w:ascii="微软雅黑" w:hAnsi="微软雅黑" w:eastAsia="微软雅黑"/>
-          <w:b w:val="0"/>
-          <w:color w:val="2D3142"/>
-          <w:sz w:val="21"/>
-        </w:rPr>
-        <w:t>安装命令是订单专属凭证，转卖即视为分销（详见群公告 EULA）；凭证可被卖家远程停用。</w:t>
+        <w:t>ZIP 的下载链接每3天刷新，过期索取卖家最新链接；已安装内容不因链接过期失效。专属链接不要公开。</w:t>
       </w:r>
     </w:p>
     <w:p>

</xml_diff>